<commit_message>
fix(render): preserve semantic resume section headings
</commit_message>
<xml_diff>
--- a/examples/demo/people/jordan-rivera/resumes/active/data-analyst/Jordan_Rivera_Resume.docx
+++ b/examples/demo/people/jordan-rivera/resumes/active/data-analyst/Jordan_Rivera_Resume.docx
@@ -99,7 +99,7 @@
         </w:rPr>
         <w:t xml:space="preserve">   •   </w:t>
       </w:r>
-      <w:hyperlink w:history="1" r:id="rIdpwxq76pszcbwlkh3l1cux">
+      <w:hyperlink w:history="1" r:id="rIdtxnjp4wa0pfhvqmfr2wwz">
         <w:r>
           <w:rPr>
             <w:rFonts w:ascii="Calibri" w:cs="Calibri" w:eastAsia="Calibri" w:hAnsi="Calibri"/>
@@ -119,7 +119,7 @@
         </w:rPr>
         <w:t xml:space="preserve">   •   </w:t>
       </w:r>
-      <w:hyperlink w:history="1" r:id="rIdb-nn9ugqlrt2oprtpzxok">
+      <w:hyperlink w:history="1" r:id="rId5g3rs_-inzy5zoz4kwj6a">
         <w:r>
           <w:rPr>
             <w:rFonts w:ascii="Calibri" w:cs="Calibri" w:eastAsia="Calibri" w:hAnsi="Calibri"/>
@@ -139,7 +139,7 @@
         </w:rPr>
         <w:t xml:space="preserve">   •   </w:t>
       </w:r>
-      <w:hyperlink w:history="1" r:id="rIdupq0_ansg_ufynzdlhpl7">
+      <w:hyperlink w:history="1" r:id="rIdra3bimoouh65dcy81almo">
         <w:r>
           <w:rPr>
             <w:rFonts w:ascii="Calibri" w:cs="Calibri" w:eastAsia="Calibri" w:hAnsi="Calibri"/>
@@ -156,6 +156,7 @@
         <w:keepNext/>
         <w:spacing w:after="80" w:before="210" w:line="280" w:lineRule="exact"/>
         <w:ind w:left="190"/>
+        <w:outlineLvl w:val="0"/>
       </w:pPr>
       <w:r>
         <w:drawing>
@@ -234,6 +235,7 @@
         <w:keepNext/>
         <w:spacing w:after="80" w:before="210" w:line="280" w:lineRule="exact"/>
         <w:ind w:left="190"/>
+        <w:outlineLvl w:val="0"/>
       </w:pPr>
       <w:r>
         <w:drawing>
@@ -373,6 +375,7 @@
         <w:keepNext/>
         <w:spacing w:after="80" w:before="210" w:line="280" w:lineRule="exact"/>
         <w:ind w:left="190"/>
+        <w:outlineLvl w:val="0"/>
       </w:pPr>
       <w:r>
         <w:drawing>
@@ -736,6 +739,7 @@
         <w:keepNext/>
         <w:spacing w:after="80" w:before="210" w:line="280" w:lineRule="exact"/>
         <w:ind w:left="190"/>
+        <w:outlineLvl w:val="0"/>
       </w:pPr>
       <w:r>
         <w:drawing>
@@ -850,6 +854,7 @@
         <w:keepNext/>
         <w:spacing w:after="80" w:before="210" w:line="280" w:lineRule="exact"/>
         <w:ind w:left="190"/>
+        <w:outlineLvl w:val="0"/>
       </w:pPr>
       <w:r>
         <w:drawing>

</xml_diff>